<commit_message>
Add live Google Form links to References [12] and [13]
Use the published survey and feedback view URLs as Available lines.

Co-authored-by: omkeluskar <omkeluskar@users.noreply.github.com>
</commit_message>
<xml_diff>
--- a/cep-iot-bus-stop/chapters/References.docx
+++ b/cep-iot-bus-stop/chapters/References.docx
@@ -943,21 +943,17 @@
         </w:rPr>
         <w:t xml:space="preserve">Available - </w:t>
       </w:r>
-      <w:r>
-        <w:rPr>
-          <w:rFonts w:ascii="Times New Roman" w:hAnsi="Times New Roman" w:eastAsia="Times New Roman"/>
-          <w:b w:val="0"/>
-          <w:i/>
-          <w:sz w:val="24"/>
-          <w:u w:val="none"/>
-        </w:rPr>
-        <w:t>(paste your 25-commuter survey Google Form link here)</w:t>
-      </w:r>
-    </w:p>
-    <w:p>
-      <w:r>
-        <w:br w:type="page"/>
-      </w:r>
+      <w:hyperlink r:id="rId22">
+        <w:r>
+          <w:rPr>
+            <w:rFonts w:ascii="Times New Roman" w:hAnsi="Times New Roman"/>
+            <w:sz w:val="24"/>
+            <w:color w:val="0563C1"/>
+            <w:u w:val="single"/>
+          </w:rPr>
+          <w:t xml:space="preserve">https://docs.google.com/forms/d/e/1FAIpQLSe1pXC0DwTRz2NLJ_oS6b2FFWWYmC9iJmTxdd4TBqYsoH6CHw/viewform</w:t>
+        </w:r>
+      </w:hyperlink>
     </w:p>
     <w:p>
       <w:pPr>
@@ -1008,16 +1004,17 @@
         </w:rPr>
         <w:t xml:space="preserve">Available - </w:t>
       </w:r>
-      <w:r>
-        <w:rPr>
-          <w:rFonts w:ascii="Times New Roman" w:hAnsi="Times New Roman" w:eastAsia="Times New Roman"/>
-          <w:b w:val="0"/>
-          <w:i/>
-          <w:sz w:val="24"/>
-          <w:u w:val="none"/>
-        </w:rPr>
-        <w:t>(paste your post-deployment feedback Google Form link here)</w:t>
-      </w:r>
+      <w:hyperlink r:id="rId23">
+        <w:r>
+          <w:rPr>
+            <w:rFonts w:ascii="Times New Roman" w:hAnsi="Times New Roman"/>
+            <w:sz w:val="24"/>
+            <w:color w:val="0563C1"/>
+            <w:u w:val="single"/>
+          </w:rPr>
+          <w:t xml:space="preserve">https://docs.google.com/forms/d/e/1FAIpQLSdpJwxrxc6T0Tf-GYctpIiKUUlcPdB5d_HhPw07ZDOkjEFIjw/viewform</w:t>
+        </w:r>
+      </w:hyperlink>
     </w:p>
     <w:sectPr>
       <w:headerReference w:type="default" r:id="rId9"/>

</xml_diff>